<commit_message>
fix: harden GOV decision governance
</commit_message>
<xml_diff>
--- a/docs/entrega/challenge_sprint3_gov.docx
+++ b/docs/entrega/challenge_sprint3_gov.docx
@@ -2781,7 +2781,7 @@
         <w:t>Informação</w:t>
       </w:r>
       <w:r>
-        <w:t>, o pipeline converte o valor para a unidade contratada e verifica domínio físico, atualidade, completude e duplicidade, produzindo um estado de qualidade.</w:t>
+        <w:t>, o pipeline confere se a unidade recebida corresponde à unidade contratada e verifica domínio físico, atualidade, completude e duplicidade, produzindo um estado de qualidade.</w:t>
       </w:r>
     </w:p>
     <w:p>
@@ -3106,7 +3106,7 @@
                 <w:rFonts w:ascii="Arial" w:hAnsi="Arial"/>
                 <w:sz w:val="18"/>
               </w:rPr>
-              <w:t>Conversão de unidade e controles de qualidade</w:t>
+              <w:t>Validação da unidade e controles de qualidade</w:t>
             </w:r>
           </w:p>
         </w:tc>
@@ -3158,7 +3158,7 @@
                 <w:rFonts w:ascii="Arial" w:hAnsi="Arial"/>
                 <w:sz w:val="18"/>
               </w:rPr>
-              <w:t>Valor normalizado com estado de qualidade</w:t>
+              <w:t>Valor validado com estado de qualidade</w:t>
             </w:r>
           </w:p>
         </w:tc>
@@ -8143,12 +8143,7 @@
         <w:t>VALIDADO POR HUMANO:</w:t>
       </w:r>
       <w:r>
-        <w:t xml:space="preserve"> ícone com checkmark verde. Descrição: “[Nome do validador] validou em</w:t>
-      </w:r>
-    </w:p>
-    <w:p>
-      <w:r>
-        <w:t>[data/hora]”;</w:t>
+        <w:t xml:space="preserve"> checkmark verde; a descrição registra validador, data e hora;</w:t>
       </w:r>
     </w:p>
     <w:p>
@@ -8162,7 +8157,7 @@
         <w:t>GERADO POR IA:</w:t>
       </w:r>
       <w:r>
-        <w:t xml:space="preserve"> ícone com engrenagem. Descrição: “Extraído por IA v3.2.1 com XX% confiança”;</w:t>
+        <w:t xml:space="preserve"> engrenagem; a descrição registra versão do algoritmo e confiança;</w:t>
       </w:r>
     </w:p>
     <w:p>
@@ -8176,12 +8171,7 @@
         <w:t>PENDENTE DE VALIDAÇÃO:</w:t>
       </w:r>
       <w:r>
-        <w:t xml:space="preserve"> ícone com interrogação amarela. Descrição: “Aguardando revisão</w:t>
-      </w:r>
-    </w:p>
-    <w:p>
-      <w:r>
-        <w:t>manual”.</w:t>
+        <w:t xml:space="preserve"> interrogação amarela; a descrição informa revisão pendente.</w:t>
       </w:r>
     </w:p>
     <w:p>
@@ -9700,7 +9690,7 @@
     </w:p>
     <w:p>
       <w:r>
-        <w:t>A aplicação também permite editar as leituras manualmente para a demonstração e oferece ao especialista as opções Pendente, Validado e Rejeitado, sempre com justificativa. Assim, a continuidade com a Sprint 2 não está apenas na aparência: os disclaimers, a origem do dado, a clareza do status e a rastreabilidade são transformados em estados, regras e registros que podem ser verificados durante a execução.</w:t>
+        <w:t>A aplicação também permite editar as leituras e a quantidade de janelas anômalas consecutivas para a demonstração e oferece ao especialista as opções Pendente, Validado e Rejeitado, sempre com justificativa. Assim, a continuidade com a Sprint 2 não está apenas na aparência: os disclaimers, a origem do dado, a clareza do status e a rastreabilidade são transformados em estados, regras e registros que podem ser verificados durante a execução.</w:t>
       </w:r>
     </w:p>
     <w:p>
@@ -11101,6 +11091,14 @@
         <w:pStyle w:val="ListBullet"/>
       </w:pPr>
       <w:r>
+        <w:t>Metric Contract obrigatório ausente ou com versão incompatível;</w:t>
+      </w:r>
+    </w:p>
+    <w:p>
+      <w:pPr>
+        <w:pStyle w:val="ListBullet"/>
+      </w:pPr>
+      <w:r>
         <w:t>unidade incompatível;</w:t>
       </w:r>
     </w:p>
@@ -11172,7 +11170,17 @@
         <w:t>pending</w:t>
       </w:r>
       <w:r>
-        <w:t>. O pacote inclui identificação do motor, leituras, thresholds, score, persistência, confiança, motivo do breaker, evidências e destinatário. O Engenheiro de Manutenção pode marcar a recomendação como validada ou rejeitada, registrando justificativa. A alteração fica vinculada ao alerta e não modifica os fatos produzidos pelo modelo.</w:t>
+        <w:t xml:space="preserve">. O pacote inclui identificação do motor, leituras, thresholds, score, persistência, confiança, motivo do breaker, evidências e destinatário. O Engenheiro de Manutenção pode marcar a recomendação como validada ou rejeitada, registrando justificativa. A alteração fica vinculada ao alerta, não modifica os fatos produzidos pelo modelo e é acrescentada ao histórico local </w:t>
+      </w:r>
+      <w:r>
+        <w:rPr>
+          <w:rFonts w:ascii="Consolas" w:hAnsi="Consolas"/>
+          <w:sz w:val="20"/>
+        </w:rPr>
+        <w:t>runtime/handoff_audit.jsonl</w:t>
+      </w:r>
+      <w:r>
+        <w:t>, além de permanecer visível na sessão atual.</w:t>
       </w:r>
     </w:p>
     <w:p>
@@ -12243,7 +12251,7 @@
       <w:r>
         <w:drawing>
           <wp:inline xmlns:a="http://schemas.openxmlformats.org/drawingml/2006/main" xmlns:pic="http://schemas.openxmlformats.org/drawingml/2006/picture">
-            <wp:extent cx="5715000" cy="2818209"/>
+            <wp:extent cx="5715000" cy="2878336"/>
             <wp:docPr id="2" name="Picture 2" descr="Operação normal" title="Operação normal"/>
             <wp:cNvGraphicFramePr>
               <a:graphicFrameLocks noChangeAspect="1"/>
@@ -12264,7 +12272,7 @@
                   <pic:spPr>
                     <a:xfrm>
                       <a:off x="0" y="0"/>
-                      <a:ext cx="5715000" cy="2818209"/>
+                      <a:ext cx="5715000" cy="2878336"/>
                     </a:xfrm>
                     <a:prstGeom prst="rect"/>
                   </pic:spPr>
@@ -12313,7 +12321,7 @@
       <w:r>
         <w:drawing>
           <wp:inline xmlns:a="http://schemas.openxmlformats.org/drawingml/2006/main" xmlns:pic="http://schemas.openxmlformats.org/drawingml/2006/picture">
-            <wp:extent cx="5715000" cy="3571875"/>
+            <wp:extent cx="5715000" cy="2878336"/>
             <wp:docPr id="3" name="Picture 3" descr="Faixa de atenção" title="Faixa de atenção"/>
             <wp:cNvGraphicFramePr>
               <a:graphicFrameLocks noChangeAspect="1"/>
@@ -12334,7 +12342,7 @@
                   <pic:spPr>
                     <a:xfrm>
                       <a:off x="0" y="0"/>
-                      <a:ext cx="5715000" cy="3571875"/>
+                      <a:ext cx="5715000" cy="2878336"/>
                     </a:xfrm>
                     <a:prstGeom prst="rect"/>
                   </pic:spPr>
@@ -12383,7 +12391,7 @@
       <w:r>
         <w:drawing>
           <wp:inline xmlns:a="http://schemas.openxmlformats.org/drawingml/2006/main" xmlns:pic="http://schemas.openxmlformats.org/drawingml/2006/picture">
-            <wp:extent cx="5715000" cy="3571875"/>
+            <wp:extent cx="5715000" cy="2878336"/>
             <wp:docPr id="4" name="Picture 4" descr="Anomalia confirmada" title="Anomalia confirmada"/>
             <wp:cNvGraphicFramePr>
               <a:graphicFrameLocks noChangeAspect="1"/>
@@ -12404,7 +12412,7 @@
                   <pic:spPr>
                     <a:xfrm>
                       <a:off x="0" y="0"/>
-                      <a:ext cx="5715000" cy="3571875"/>
+                      <a:ext cx="5715000" cy="2878336"/>
                     </a:xfrm>
                     <a:prstGeom prst="rect"/>
                   </pic:spPr>
@@ -12453,7 +12461,7 @@
       <w:r>
         <w:drawing>
           <wp:inline xmlns:a="http://schemas.openxmlformats.org/drawingml/2006/main" xmlns:pic="http://schemas.openxmlformats.org/drawingml/2006/picture">
-            <wp:extent cx="5715000" cy="3571875"/>
+            <wp:extent cx="5715000" cy="2878336"/>
             <wp:docPr id="5" name="Picture 5" descr="Circuit Breaker" title="Circuit Breaker"/>
             <wp:cNvGraphicFramePr>
               <a:graphicFrameLocks noChangeAspect="1"/>
@@ -12474,7 +12482,7 @@
                   <pic:spPr>
                     <a:xfrm>
                       <a:off x="0" y="0"/>
-                      <a:ext cx="5715000" cy="3571875"/>
+                      <a:ext cx="5715000" cy="2878336"/>
                     </a:xfrm>
                     <a:prstGeom prst="rect"/>
                   </pic:spPr>
@@ -12523,7 +12531,7 @@
       <w:r>
         <w:drawing>
           <wp:inline xmlns:a="http://schemas.openxmlformats.org/drawingml/2006/main" xmlns:pic="http://schemas.openxmlformats.org/drawingml/2006/picture">
-            <wp:extent cx="5715000" cy="3571875"/>
+            <wp:extent cx="5715000" cy="2878336"/>
             <wp:docPr id="6" name="Picture 6" descr="Handoff" title="Handoff"/>
             <wp:cNvGraphicFramePr>
               <a:graphicFrameLocks noChangeAspect="1"/>
@@ -12544,7 +12552,7 @@
                   <pic:spPr>
                     <a:xfrm>
                       <a:off x="0" y="0"/>
-                      <a:ext cx="5715000" cy="3571875"/>
+                      <a:ext cx="5715000" cy="2878336"/>
                     </a:xfrm>
                     <a:prstGeom prst="rect"/>
                   </pic:spPr>

</xml_diff>

<commit_message>
fix: polish academic delivery visuals
</commit_message>
<xml_diff>
--- a/docs/entrega/challenge_sprint3_gov.docx
+++ b/docs/entrega/challenge_sprint3_gov.docx
@@ -1190,7 +1190,7 @@
                 <w:rFonts w:ascii="Arial" w:hAnsi="Arial"/>
                 <w:sz w:val="18"/>
               </w:rPr>
-              <w:t>Consultar logs imutáveis em modo leitura</w:t>
+              <w:t>Consultar logs de auditoria em modo leitura</w:t>
             </w:r>
           </w:p>
         </w:tc>
@@ -8701,12 +8701,12 @@
         <w:tblInd w:type="dxa" w:w="120"/>
       </w:tblPr>
       <w:tblGrid>
-        <w:gridCol w:w="2721"/>
-        <w:gridCol w:w="2474"/>
-        <w:gridCol w:w="412"/>
-        <w:gridCol w:w="1154"/>
-        <w:gridCol w:w="742"/>
-        <w:gridCol w:w="1568"/>
+        <w:gridCol w:w="2411"/>
+        <w:gridCol w:w="2182"/>
+        <w:gridCol w:w="919"/>
+        <w:gridCol w:w="1148"/>
+        <w:gridCol w:w="919"/>
+        <w:gridCol w:w="1492"/>
       </w:tblGrid>
       <w:tr>
         <w:trPr>
@@ -8714,7 +8714,7 @@
         </w:trPr>
         <w:tc>
           <w:tcPr>
-            <w:tcW w:type="dxa" w:w="2721"/>
+            <w:tcW w:type="dxa" w:w="2411"/>
             <w:tcMar>
               <w:top w:type="dxa" w:w="90"/>
               <w:bottom w:type="dxa" w:w="90"/>
@@ -8743,7 +8743,7 @@
         </w:tc>
         <w:tc>
           <w:tcPr>
-            <w:tcW w:type="dxa" w:w="2474"/>
+            <w:tcW w:type="dxa" w:w="2182"/>
             <w:tcMar>
               <w:top w:type="dxa" w:w="90"/>
               <w:bottom w:type="dxa" w:w="90"/>
@@ -8772,7 +8772,7 @@
         </w:tc>
         <w:tc>
           <w:tcPr>
-            <w:tcW w:type="dxa" w:w="412"/>
+            <w:tcW w:type="dxa" w:w="919"/>
             <w:tcMar>
               <w:top w:type="dxa" w:w="90"/>
               <w:bottom w:type="dxa" w:w="90"/>
@@ -8801,7 +8801,7 @@
         </w:tc>
         <w:tc>
           <w:tcPr>
-            <w:tcW w:type="dxa" w:w="1154"/>
+            <w:tcW w:type="dxa" w:w="1148"/>
             <w:tcMar>
               <w:top w:type="dxa" w:w="90"/>
               <w:bottom w:type="dxa" w:w="90"/>
@@ -8830,7 +8830,7 @@
         </w:tc>
         <w:tc>
           <w:tcPr>
-            <w:tcW w:type="dxa" w:w="742"/>
+            <w:tcW w:type="dxa" w:w="919"/>
             <w:tcMar>
               <w:top w:type="dxa" w:w="90"/>
               <w:bottom w:type="dxa" w:w="90"/>
@@ -8859,7 +8859,7 @@
         </w:tc>
         <w:tc>
           <w:tcPr>
-            <w:tcW w:type="dxa" w:w="1568"/>
+            <w:tcW w:type="dxa" w:w="1492"/>
             <w:tcMar>
               <w:top w:type="dxa" w:w="90"/>
               <w:bottom w:type="dxa" w:w="90"/>
@@ -8890,7 +8890,7 @@
       <w:tr>
         <w:tc>
           <w:tcPr>
-            <w:tcW w:type="dxa" w:w="2721"/>
+            <w:tcW w:type="dxa" w:w="2411"/>
             <w:tcMar>
               <w:top w:type="dxa" w:w="90"/>
               <w:bottom w:type="dxa" w:w="90"/>
@@ -8916,7 +8916,7 @@
         </w:tc>
         <w:tc>
           <w:tcPr>
-            <w:tcW w:type="dxa" w:w="2474"/>
+            <w:tcW w:type="dxa" w:w="2182"/>
             <w:tcMar>
               <w:top w:type="dxa" w:w="90"/>
               <w:bottom w:type="dxa" w:w="90"/>
@@ -8942,7 +8942,7 @@
         </w:tc>
         <w:tc>
           <w:tcPr>
-            <w:tcW w:type="dxa" w:w="412"/>
+            <w:tcW w:type="dxa" w:w="919"/>
             <w:tcMar>
               <w:top w:type="dxa" w:w="90"/>
               <w:bottom w:type="dxa" w:w="90"/>
@@ -8968,7 +8968,7 @@
         </w:tc>
         <w:tc>
           <w:tcPr>
-            <w:tcW w:type="dxa" w:w="1154"/>
+            <w:tcW w:type="dxa" w:w="1148"/>
             <w:tcMar>
               <w:top w:type="dxa" w:w="90"/>
               <w:bottom w:type="dxa" w:w="90"/>
@@ -8994,7 +8994,7 @@
         </w:tc>
         <w:tc>
           <w:tcPr>
-            <w:tcW w:type="dxa" w:w="742"/>
+            <w:tcW w:type="dxa" w:w="919"/>
             <w:tcMar>
               <w:top w:type="dxa" w:w="90"/>
               <w:bottom w:type="dxa" w:w="90"/>
@@ -9020,7 +9020,7 @@
         </w:tc>
         <w:tc>
           <w:tcPr>
-            <w:tcW w:type="dxa" w:w="1568"/>
+            <w:tcW w:type="dxa" w:w="1492"/>
             <w:tcMar>
               <w:top w:type="dxa" w:w="90"/>
               <w:bottom w:type="dxa" w:w="90"/>
@@ -9048,7 +9048,7 @@
       <w:tr>
         <w:tc>
           <w:tcPr>
-            <w:tcW w:type="dxa" w:w="2721"/>
+            <w:tcW w:type="dxa" w:w="2411"/>
             <w:tcMar>
               <w:top w:type="dxa" w:w="90"/>
               <w:bottom w:type="dxa" w:w="90"/>
@@ -9074,7 +9074,7 @@
         </w:tc>
         <w:tc>
           <w:tcPr>
-            <w:tcW w:type="dxa" w:w="2474"/>
+            <w:tcW w:type="dxa" w:w="2182"/>
             <w:tcMar>
               <w:top w:type="dxa" w:w="90"/>
               <w:bottom w:type="dxa" w:w="90"/>
@@ -9100,7 +9100,7 @@
         </w:tc>
         <w:tc>
           <w:tcPr>
-            <w:tcW w:type="dxa" w:w="412"/>
+            <w:tcW w:type="dxa" w:w="919"/>
             <w:tcMar>
               <w:top w:type="dxa" w:w="90"/>
               <w:bottom w:type="dxa" w:w="90"/>
@@ -9126,7 +9126,7 @@
         </w:tc>
         <w:tc>
           <w:tcPr>
-            <w:tcW w:type="dxa" w:w="1154"/>
+            <w:tcW w:type="dxa" w:w="1148"/>
             <w:tcMar>
               <w:top w:type="dxa" w:w="90"/>
               <w:bottom w:type="dxa" w:w="90"/>
@@ -9152,7 +9152,7 @@
         </w:tc>
         <w:tc>
           <w:tcPr>
-            <w:tcW w:type="dxa" w:w="742"/>
+            <w:tcW w:type="dxa" w:w="919"/>
             <w:tcMar>
               <w:top w:type="dxa" w:w="90"/>
               <w:bottom w:type="dxa" w:w="90"/>
@@ -9178,7 +9178,7 @@
         </w:tc>
         <w:tc>
           <w:tcPr>
-            <w:tcW w:type="dxa" w:w="1568"/>
+            <w:tcW w:type="dxa" w:w="1492"/>
             <w:tcMar>
               <w:top w:type="dxa" w:w="90"/>
               <w:bottom w:type="dxa" w:w="90"/>
@@ -9206,7 +9206,7 @@
       <w:tr>
         <w:tc>
           <w:tcPr>
-            <w:tcW w:type="dxa" w:w="2721"/>
+            <w:tcW w:type="dxa" w:w="2411"/>
             <w:tcMar>
               <w:top w:type="dxa" w:w="90"/>
               <w:bottom w:type="dxa" w:w="90"/>
@@ -9232,7 +9232,7 @@
         </w:tc>
         <w:tc>
           <w:tcPr>
-            <w:tcW w:type="dxa" w:w="2474"/>
+            <w:tcW w:type="dxa" w:w="2182"/>
             <w:tcMar>
               <w:top w:type="dxa" w:w="90"/>
               <w:bottom w:type="dxa" w:w="90"/>
@@ -9258,7 +9258,7 @@
         </w:tc>
         <w:tc>
           <w:tcPr>
-            <w:tcW w:type="dxa" w:w="412"/>
+            <w:tcW w:type="dxa" w:w="919"/>
             <w:tcMar>
               <w:top w:type="dxa" w:w="90"/>
               <w:bottom w:type="dxa" w:w="90"/>
@@ -9284,7 +9284,7 @@
         </w:tc>
         <w:tc>
           <w:tcPr>
-            <w:tcW w:type="dxa" w:w="1154"/>
+            <w:tcW w:type="dxa" w:w="1148"/>
             <w:tcMar>
               <w:top w:type="dxa" w:w="90"/>
               <w:bottom w:type="dxa" w:w="90"/>
@@ -9310,7 +9310,7 @@
         </w:tc>
         <w:tc>
           <w:tcPr>
-            <w:tcW w:type="dxa" w:w="742"/>
+            <w:tcW w:type="dxa" w:w="919"/>
             <w:tcMar>
               <w:top w:type="dxa" w:w="90"/>
               <w:bottom w:type="dxa" w:w="90"/>
@@ -9336,7 +9336,7 @@
         </w:tc>
         <w:tc>
           <w:tcPr>
-            <w:tcW w:type="dxa" w:w="1568"/>
+            <w:tcW w:type="dxa" w:w="1492"/>
             <w:tcMar>
               <w:top w:type="dxa" w:w="90"/>
               <w:bottom w:type="dxa" w:w="90"/>
@@ -9364,7 +9364,7 @@
       <w:tr>
         <w:tc>
           <w:tcPr>
-            <w:tcW w:type="dxa" w:w="2721"/>
+            <w:tcW w:type="dxa" w:w="2411"/>
             <w:tcMar>
               <w:top w:type="dxa" w:w="90"/>
               <w:bottom w:type="dxa" w:w="90"/>
@@ -9390,7 +9390,7 @@
         </w:tc>
         <w:tc>
           <w:tcPr>
-            <w:tcW w:type="dxa" w:w="2474"/>
+            <w:tcW w:type="dxa" w:w="2182"/>
             <w:tcMar>
               <w:top w:type="dxa" w:w="90"/>
               <w:bottom w:type="dxa" w:w="90"/>
@@ -9416,7 +9416,7 @@
         </w:tc>
         <w:tc>
           <w:tcPr>
-            <w:tcW w:type="dxa" w:w="412"/>
+            <w:tcW w:type="dxa" w:w="919"/>
             <w:tcMar>
               <w:top w:type="dxa" w:w="90"/>
               <w:bottom w:type="dxa" w:w="90"/>
@@ -9442,7 +9442,7 @@
         </w:tc>
         <w:tc>
           <w:tcPr>
-            <w:tcW w:type="dxa" w:w="1154"/>
+            <w:tcW w:type="dxa" w:w="1148"/>
             <w:tcMar>
               <w:top w:type="dxa" w:w="90"/>
               <w:bottom w:type="dxa" w:w="90"/>
@@ -9468,7 +9468,7 @@
         </w:tc>
         <w:tc>
           <w:tcPr>
-            <w:tcW w:type="dxa" w:w="742"/>
+            <w:tcW w:type="dxa" w:w="919"/>
             <w:tcMar>
               <w:top w:type="dxa" w:w="90"/>
               <w:bottom w:type="dxa" w:w="90"/>
@@ -9494,7 +9494,7 @@
         </w:tc>
         <w:tc>
           <w:tcPr>
-            <w:tcW w:type="dxa" w:w="1568"/>
+            <w:tcW w:type="dxa" w:w="1492"/>
             <w:tcMar>
               <w:top w:type="dxa" w:w="90"/>
               <w:bottom w:type="dxa" w:w="90"/>
@@ -9522,7 +9522,7 @@
       <w:tr>
         <w:tc>
           <w:tcPr>
-            <w:tcW w:type="dxa" w:w="2721"/>
+            <w:tcW w:type="dxa" w:w="2411"/>
             <w:tcMar>
               <w:top w:type="dxa" w:w="90"/>
               <w:bottom w:type="dxa" w:w="90"/>
@@ -9548,7 +9548,7 @@
         </w:tc>
         <w:tc>
           <w:tcPr>
-            <w:tcW w:type="dxa" w:w="2474"/>
+            <w:tcW w:type="dxa" w:w="2182"/>
             <w:tcMar>
               <w:top w:type="dxa" w:w="90"/>
               <w:bottom w:type="dxa" w:w="90"/>
@@ -9574,7 +9574,7 @@
         </w:tc>
         <w:tc>
           <w:tcPr>
-            <w:tcW w:type="dxa" w:w="412"/>
+            <w:tcW w:type="dxa" w:w="919"/>
             <w:tcMar>
               <w:top w:type="dxa" w:w="90"/>
               <w:bottom w:type="dxa" w:w="90"/>
@@ -9600,7 +9600,7 @@
         </w:tc>
         <w:tc>
           <w:tcPr>
-            <w:tcW w:type="dxa" w:w="1154"/>
+            <w:tcW w:type="dxa" w:w="1148"/>
             <w:tcMar>
               <w:top w:type="dxa" w:w="90"/>
               <w:bottom w:type="dxa" w:w="90"/>
@@ -9626,7 +9626,7 @@
         </w:tc>
         <w:tc>
           <w:tcPr>
-            <w:tcW w:type="dxa" w:w="742"/>
+            <w:tcW w:type="dxa" w:w="919"/>
             <w:tcMar>
               <w:top w:type="dxa" w:w="90"/>
               <w:bottom w:type="dxa" w:w="90"/>
@@ -9652,7 +9652,7 @@
         </w:tc>
         <w:tc>
           <w:tcPr>
-            <w:tcW w:type="dxa" w:w="1568"/>
+            <w:tcW w:type="dxa" w:w="1492"/>
             <w:tcMar>
               <w:top w:type="dxa" w:w="90"/>
               <w:bottom w:type="dxa" w:w="90"/>

</xml_diff>